<commit_message>
Potential fix for addendum template bug
</commit_message>
<xml_diff>
--- a/docassemble/CivilNoContactOrderRequest/data/templates/cnco_events_addendum.docx
+++ b/docassemble/CivilNoContactOrderRequest/data/templates/cnco_events_addendum.docx
@@ -289,7 +289,37 @@
         <w:rPr>
           <w:rFonts w:ascii="Arial" w:hAnsi="Arial" w:cs="Arial"/>
         </w:rPr>
-        <w:t>{% if event.include_in_addendum == True %}</w:t>
+        <w:t xml:space="preserve">{% if </w:t>
+      </w:r>
+      <w:r>
+        <w:rPr>
+          <w:rFonts w:ascii="Arial" w:hAnsi="Arial" w:cs="Arial"/>
+        </w:rPr>
+        <w:t>loop.</w:t>
+      </w:r>
+      <w:r>
+        <w:rPr>
+          <w:rFonts w:ascii="Arial" w:hAnsi="Arial" w:cs="Arial"/>
+        </w:rPr>
+        <w:t>index</w:t>
+      </w:r>
+      <w:r>
+        <w:rPr>
+          <w:rFonts w:ascii="Arial" w:hAnsi="Arial" w:cs="Arial"/>
+        </w:rPr>
+        <w:t>0</w:t>
+      </w:r>
+      <w:r>
+        <w:rPr>
+          <w:rFonts w:ascii="Arial" w:hAnsi="Arial" w:cs="Arial"/>
+        </w:rPr>
+        <w:t xml:space="preserve"> &gt; 0</w:t>
+      </w:r>
+      <w:r>
+        <w:rPr>
+          <w:rFonts w:ascii="Arial" w:hAnsi="Arial" w:cs="Arial"/>
+        </w:rPr>
+        <w:t xml:space="preserve"> %}</w:t>
       </w:r>
     </w:p>
     <w:tbl>
@@ -665,7 +695,13 @@
         <w:rPr>
           <w:rFonts w:ascii="Arial" w:hAnsi="Arial" w:cs="Arial"/>
         </w:rPr>
-        <w:t xml:space="preserve"> event</w:t>
+        <w:t xml:space="preserve"> </w:t>
+      </w:r>
+      <w:r>
+        <w:rPr>
+          <w:rFonts w:ascii="Arial" w:hAnsi="Arial" w:cs="Arial"/>
+        </w:rPr>
+        <w:t>event</w:t>
       </w:r>
       <w:r>
         <w:rPr>
@@ -689,7 +725,37 @@
         <w:rPr>
           <w:rFonts w:ascii="Arial" w:hAnsi="Arial" w:cs="Arial"/>
         </w:rPr>
-        <w:t>{% if event.include_in_addendum == True %}</w:t>
+        <w:t xml:space="preserve">{% if </w:t>
+      </w:r>
+      <w:r>
+        <w:rPr>
+          <w:rFonts w:ascii="Arial" w:hAnsi="Arial" w:cs="Arial"/>
+        </w:rPr>
+        <w:t>loop.</w:t>
+      </w:r>
+      <w:r>
+        <w:rPr>
+          <w:rFonts w:ascii="Arial" w:hAnsi="Arial" w:cs="Arial"/>
+        </w:rPr>
+        <w:t>index</w:t>
+      </w:r>
+      <w:r>
+        <w:rPr>
+          <w:rFonts w:ascii="Arial" w:hAnsi="Arial" w:cs="Arial"/>
+        </w:rPr>
+        <w:t>0</w:t>
+      </w:r>
+      <w:r>
+        <w:rPr>
+          <w:rFonts w:ascii="Arial" w:hAnsi="Arial" w:cs="Arial"/>
+        </w:rPr>
+        <w:t xml:space="preserve"> &gt; 0</w:t>
+      </w:r>
+      <w:r>
+        <w:rPr>
+          <w:rFonts w:ascii="Arial" w:hAnsi="Arial" w:cs="Arial"/>
+        </w:rPr>
+        <w:t xml:space="preserve"> %}</w:t>
       </w:r>
     </w:p>
     <w:tbl>

</xml_diff>